<commit_message>
docs: add CDE evidence audit feedback
</commit_message>
<xml_diff>
--- a/docs/cde_2026_paper_draft_ko.docx
+++ b/docs/cde_2026_paper_draft_ko.docx
@@ -1926,6 +1926,553 @@
                 <w:sz w:val="13"/>
               </w:rPr>
               <w:t>0.00%</w:t>
+            </w:r>
+          </w:p>
+        </w:tc>
+      </w:tr>
+    </w:tbl>
+    <w:p>
+      <w:pPr>
+        <w:spacing w:after="80" w:line="252" w:lineRule="auto"/>
+      </w:pPr>
+    </w:p>
+    <w:p>
+      <w:pPr>
+        <w:pStyle w:val="af2"/>
+        <w:spacing w:after="80" w:line="252" w:lineRule="auto"/>
+      </w:pPr>
+      <w:r>
+        <w:rPr>
+          <w:rFonts w:ascii="Times New Roman" w:hAnsi="Times New Roman" w:eastAsia="바탕"/>
+          <w:b w:val="0"/>
+          <w:sz w:val="18"/>
+        </w:rPr>
+        <w:t>추가 감사에서는 최근 AI 테마 corpus의 세 `as_of_date` 샘플에 대해 문서의 `published_at`과 가격 데이터의 `timestamp`가 의사결정일을 넘지 않는지 확인하였다. Table 3에서 각 샘플의 최대 문서일과 최대 가격일은 모두 `as_of_date` 이하였고, 미래 날짜 레코드는 검색 및 가격 특징 계산에서 제외되었다.</w:t>
+      </w:r>
+    </w:p>
+    <w:p>
+      <w:pPr>
+        <w:spacing w:after="80" w:line="252" w:lineRule="auto"/>
+        <w:jc w:val="left"/>
+      </w:pPr>
+      <w:r>
+        <w:rPr>
+          <w:rFonts w:ascii="Times New Roman" w:hAnsi="Times New Roman" w:eastAsia="바탕"/>
+          <w:b w:val="0"/>
+          <w:sz w:val="15"/>
+        </w:rPr>
+        <w:t>Table 3. Temporal evidence leakage audit sample.</w:t>
+      </w:r>
+    </w:p>
+    <w:tbl>
+      <w:tblPr>
+        <w:tblStyle w:val="af4"/>
+        <w:tblW w:type="auto" w:w="0"/>
+        <w:jc w:val="center"/>
+        <w:tblLayout w:type="autofit"/>
+        <w:tblLook w:firstColumn="1" w:firstRow="1" w:lastColumn="0" w:lastRow="0" w:noHBand="0" w:noVBand="1" w:val="04A0"/>
+      </w:tblPr>
+      <w:tblGrid>
+        <w:gridCol w:w="1606"/>
+        <w:gridCol w:w="1606"/>
+        <w:gridCol w:w="1606"/>
+        <w:gridCol w:w="1606"/>
+        <w:gridCol w:w="1606"/>
+        <w:gridCol w:w="1606"/>
+      </w:tblGrid>
+      <w:tr>
+        <w:trPr>
+          <w:tblHeader w:val="true"/>
+        </w:trPr>
+        <w:tc>
+          <w:tcPr>
+            <w:tcW w:type="dxa" w:w="1606"/>
+            <w:vAlign w:val="center"/>
+            <w:shd w:fill="E9EEF4"/>
+          </w:tcPr>
+          <w:p>
+            <w:pPr>
+              <w:spacing w:after="0" w:line="240" w:lineRule="auto"/>
+              <w:jc w:val="center"/>
+            </w:pPr>
+            <w:r>
+              <w:rPr>
+                <w:rFonts w:ascii="Times New Roman" w:hAnsi="Times New Roman" w:eastAsia="Times New Roman"/>
+                <w:b/>
+                <w:sz w:val="13"/>
+              </w:rPr>
+              <w:t>as_of</w:t>
+            </w:r>
+          </w:p>
+        </w:tc>
+        <w:tc>
+          <w:tcPr>
+            <w:tcW w:type="dxa" w:w="1606"/>
+            <w:vAlign w:val="center"/>
+            <w:shd w:fill="E9EEF4"/>
+          </w:tcPr>
+          <w:p>
+            <w:pPr>
+              <w:spacing w:after="0" w:line="240" w:lineRule="auto"/>
+              <w:jc w:val="center"/>
+            </w:pPr>
+            <w:r>
+              <w:rPr>
+                <w:rFonts w:ascii="Times New Roman" w:hAnsi="Times New Roman" w:eastAsia="Times New Roman"/>
+                <w:b/>
+                <w:sz w:val="13"/>
+              </w:rPr>
+              <w:t>Docs</w:t>
+            </w:r>
+          </w:p>
+        </w:tc>
+        <w:tc>
+          <w:tcPr>
+            <w:tcW w:type="dxa" w:w="1606"/>
+            <w:vAlign w:val="center"/>
+            <w:shd w:fill="E9EEF4"/>
+          </w:tcPr>
+          <w:p>
+            <w:pPr>
+              <w:spacing w:after="0" w:line="240" w:lineRule="auto"/>
+              <w:jc w:val="center"/>
+            </w:pPr>
+            <w:r>
+              <w:rPr>
+                <w:rFonts w:ascii="Times New Roman" w:hAnsi="Times New Roman" w:eastAsia="Times New Roman"/>
+                <w:b/>
+                <w:sz w:val="13"/>
+              </w:rPr>
+              <w:t>Max doc</w:t>
+            </w:r>
+          </w:p>
+        </w:tc>
+        <w:tc>
+          <w:tcPr>
+            <w:tcW w:type="dxa" w:w="1606"/>
+            <w:vAlign w:val="center"/>
+            <w:shd w:fill="E9EEF4"/>
+          </w:tcPr>
+          <w:p>
+            <w:pPr>
+              <w:spacing w:after="0" w:line="240" w:lineRule="auto"/>
+              <w:jc w:val="center"/>
+            </w:pPr>
+            <w:r>
+              <w:rPr>
+                <w:rFonts w:ascii="Times New Roman" w:hAnsi="Times New Roman" w:eastAsia="Times New Roman"/>
+                <w:b/>
+                <w:sz w:val="13"/>
+              </w:rPr>
+              <w:t>Prices</w:t>
+            </w:r>
+          </w:p>
+        </w:tc>
+        <w:tc>
+          <w:tcPr>
+            <w:tcW w:type="dxa" w:w="1606"/>
+            <w:vAlign w:val="center"/>
+            <w:shd w:fill="E9EEF4"/>
+          </w:tcPr>
+          <w:p>
+            <w:pPr>
+              <w:spacing w:after="0" w:line="240" w:lineRule="auto"/>
+              <w:jc w:val="center"/>
+            </w:pPr>
+            <w:r>
+              <w:rPr>
+                <w:rFonts w:ascii="Times New Roman" w:hAnsi="Times New Roman" w:eastAsia="Times New Roman"/>
+                <w:b/>
+                <w:sz w:val="13"/>
+              </w:rPr>
+              <w:t>Max price</w:t>
+            </w:r>
+          </w:p>
+        </w:tc>
+        <w:tc>
+          <w:tcPr>
+            <w:tcW w:type="dxa" w:w="1606"/>
+            <w:vAlign w:val="center"/>
+            <w:shd w:fill="E9EEF4"/>
+          </w:tcPr>
+          <w:p>
+            <w:pPr>
+              <w:spacing w:after="0" w:line="240" w:lineRule="auto"/>
+              <w:jc w:val="center"/>
+            </w:pPr>
+            <w:r>
+              <w:rPr>
+                <w:rFonts w:ascii="Times New Roman" w:hAnsi="Times New Roman" w:eastAsia="Times New Roman"/>
+                <w:b/>
+                <w:sz w:val="13"/>
+              </w:rPr>
+              <w:t>Future d/p</w:t>
+            </w:r>
+          </w:p>
+        </w:tc>
+      </w:tr>
+      <w:tr>
+        <w:tc>
+          <w:tcPr>
+            <w:tcW w:type="dxa" w:w="1606"/>
+            <w:vAlign w:val="center"/>
+          </w:tcPr>
+          <w:p>
+            <w:pPr>
+              <w:spacing w:after="0" w:line="240" w:lineRule="auto"/>
+              <w:jc w:val="center"/>
+            </w:pPr>
+            <w:r>
+              <w:rPr>
+                <w:rFonts w:ascii="Times New Roman" w:hAnsi="Times New Roman" w:eastAsia="Times New Roman"/>
+                <w:b w:val="0"/>
+                <w:sz w:val="13"/>
+              </w:rPr>
+              <w:t>2026-05-20</w:t>
+            </w:r>
+          </w:p>
+        </w:tc>
+        <w:tc>
+          <w:tcPr>
+            <w:tcW w:type="dxa" w:w="1606"/>
+            <w:vAlign w:val="center"/>
+          </w:tcPr>
+          <w:p>
+            <w:pPr>
+              <w:spacing w:after="0" w:line="240" w:lineRule="auto"/>
+              <w:jc w:val="center"/>
+            </w:pPr>
+            <w:r>
+              <w:rPr>
+                <w:rFonts w:ascii="Times New Roman" w:hAnsi="Times New Roman" w:eastAsia="Times New Roman"/>
+                <w:b w:val="0"/>
+                <w:sz w:val="13"/>
+              </w:rPr>
+              <w:t>847</w:t>
+            </w:r>
+          </w:p>
+        </w:tc>
+        <w:tc>
+          <w:tcPr>
+            <w:tcW w:type="dxa" w:w="1606"/>
+            <w:vAlign w:val="center"/>
+          </w:tcPr>
+          <w:p>
+            <w:pPr>
+              <w:spacing w:after="0" w:line="240" w:lineRule="auto"/>
+              <w:jc w:val="center"/>
+            </w:pPr>
+            <w:r>
+              <w:rPr>
+                <w:rFonts w:ascii="Times New Roman" w:hAnsi="Times New Roman" w:eastAsia="Times New Roman"/>
+                <w:b w:val="0"/>
+                <w:sz w:val="13"/>
+              </w:rPr>
+              <w:t>2026-05-20</w:t>
+            </w:r>
+          </w:p>
+        </w:tc>
+        <w:tc>
+          <w:tcPr>
+            <w:tcW w:type="dxa" w:w="1606"/>
+            <w:vAlign w:val="center"/>
+          </w:tcPr>
+          <w:p>
+            <w:pPr>
+              <w:spacing w:after="0" w:line="240" w:lineRule="auto"/>
+              <w:jc w:val="center"/>
+            </w:pPr>
+            <w:r>
+              <w:rPr>
+                <w:rFonts w:ascii="Times New Roman" w:hAnsi="Times New Roman" w:eastAsia="Times New Roman"/>
+                <w:b w:val="0"/>
+                <w:sz w:val="13"/>
+              </w:rPr>
+              <w:t>400</w:t>
+            </w:r>
+          </w:p>
+        </w:tc>
+        <w:tc>
+          <w:tcPr>
+            <w:tcW w:type="dxa" w:w="1606"/>
+            <w:vAlign w:val="center"/>
+          </w:tcPr>
+          <w:p>
+            <w:pPr>
+              <w:spacing w:after="0" w:line="240" w:lineRule="auto"/>
+              <w:jc w:val="center"/>
+            </w:pPr>
+            <w:r>
+              <w:rPr>
+                <w:rFonts w:ascii="Times New Roman" w:hAnsi="Times New Roman" w:eastAsia="Times New Roman"/>
+                <w:b w:val="0"/>
+                <w:sz w:val="13"/>
+              </w:rPr>
+              <w:t>2026-05-20</w:t>
+            </w:r>
+          </w:p>
+        </w:tc>
+        <w:tc>
+          <w:tcPr>
+            <w:tcW w:type="dxa" w:w="1606"/>
+            <w:vAlign w:val="center"/>
+          </w:tcPr>
+          <w:p>
+            <w:pPr>
+              <w:spacing w:after="0" w:line="240" w:lineRule="auto"/>
+              <w:jc w:val="center"/>
+            </w:pPr>
+            <w:r>
+              <w:rPr>
+                <w:rFonts w:ascii="Times New Roman" w:hAnsi="Times New Roman" w:eastAsia="Times New Roman"/>
+                <w:b w:val="0"/>
+                <w:sz w:val="13"/>
+              </w:rPr>
+              <w:t>6151/650</w:t>
+            </w:r>
+          </w:p>
+        </w:tc>
+      </w:tr>
+      <w:tr>
+        <w:tc>
+          <w:tcPr>
+            <w:tcW w:type="dxa" w:w="1606"/>
+            <w:vAlign w:val="center"/>
+          </w:tcPr>
+          <w:p>
+            <w:pPr>
+              <w:spacing w:after="0" w:line="240" w:lineRule="auto"/>
+              <w:jc w:val="center"/>
+            </w:pPr>
+            <w:r>
+              <w:rPr>
+                <w:rFonts w:ascii="Times New Roman" w:hAnsi="Times New Roman" w:eastAsia="Times New Roman"/>
+                <w:b w:val="0"/>
+                <w:sz w:val="13"/>
+              </w:rPr>
+              <w:t>2026-05-31</w:t>
+            </w:r>
+          </w:p>
+        </w:tc>
+        <w:tc>
+          <w:tcPr>
+            <w:tcW w:type="dxa" w:w="1606"/>
+            <w:vAlign w:val="center"/>
+          </w:tcPr>
+          <w:p>
+            <w:pPr>
+              <w:spacing w:after="0" w:line="240" w:lineRule="auto"/>
+              <w:jc w:val="center"/>
+            </w:pPr>
+            <w:r>
+              <w:rPr>
+                <w:rFonts w:ascii="Times New Roman" w:hAnsi="Times New Roman" w:eastAsia="Times New Roman"/>
+                <w:b w:val="0"/>
+                <w:sz w:val="13"/>
+              </w:rPr>
+              <w:t>2130</w:t>
+            </w:r>
+          </w:p>
+        </w:tc>
+        <w:tc>
+          <w:tcPr>
+            <w:tcW w:type="dxa" w:w="1606"/>
+            <w:vAlign w:val="center"/>
+          </w:tcPr>
+          <w:p>
+            <w:pPr>
+              <w:spacing w:after="0" w:line="240" w:lineRule="auto"/>
+              <w:jc w:val="center"/>
+            </w:pPr>
+            <w:r>
+              <w:rPr>
+                <w:rFonts w:ascii="Times New Roman" w:hAnsi="Times New Roman" w:eastAsia="Times New Roman"/>
+                <w:b w:val="0"/>
+                <w:sz w:val="13"/>
+              </w:rPr>
+              <w:t>2026-05-31</w:t>
+            </w:r>
+          </w:p>
+        </w:tc>
+        <w:tc>
+          <w:tcPr>
+            <w:tcW w:type="dxa" w:w="1606"/>
+            <w:vAlign w:val="center"/>
+          </w:tcPr>
+          <w:p>
+            <w:pPr>
+              <w:spacing w:after="0" w:line="240" w:lineRule="auto"/>
+              <w:jc w:val="center"/>
+            </w:pPr>
+            <w:r>
+              <w:rPr>
+                <w:rFonts w:ascii="Times New Roman" w:hAnsi="Times New Roman" w:eastAsia="Times New Roman"/>
+                <w:b w:val="0"/>
+                <w:sz w:val="13"/>
+              </w:rPr>
+              <w:t>700</w:t>
+            </w:r>
+          </w:p>
+        </w:tc>
+        <w:tc>
+          <w:tcPr>
+            <w:tcW w:type="dxa" w:w="1606"/>
+            <w:vAlign w:val="center"/>
+          </w:tcPr>
+          <w:p>
+            <w:pPr>
+              <w:spacing w:after="0" w:line="240" w:lineRule="auto"/>
+              <w:jc w:val="center"/>
+            </w:pPr>
+            <w:r>
+              <w:rPr>
+                <w:rFonts w:ascii="Times New Roman" w:hAnsi="Times New Roman" w:eastAsia="Times New Roman"/>
+                <w:b w:val="0"/>
+                <w:sz w:val="13"/>
+              </w:rPr>
+              <w:t>2026-05-29</w:t>
+            </w:r>
+          </w:p>
+        </w:tc>
+        <w:tc>
+          <w:tcPr>
+            <w:tcW w:type="dxa" w:w="1606"/>
+            <w:vAlign w:val="center"/>
+          </w:tcPr>
+          <w:p>
+            <w:pPr>
+              <w:spacing w:after="0" w:line="240" w:lineRule="auto"/>
+              <w:jc w:val="center"/>
+            </w:pPr>
+            <w:r>
+              <w:rPr>
+                <w:rFonts w:ascii="Times New Roman" w:hAnsi="Times New Roman" w:eastAsia="Times New Roman"/>
+                <w:b w:val="0"/>
+                <w:sz w:val="13"/>
+              </w:rPr>
+              <w:t>4868/350</w:t>
+            </w:r>
+          </w:p>
+        </w:tc>
+      </w:tr>
+      <w:tr>
+        <w:tc>
+          <w:tcPr>
+            <w:tcW w:type="dxa" w:w="1606"/>
+            <w:vAlign w:val="center"/>
+          </w:tcPr>
+          <w:p>
+            <w:pPr>
+              <w:spacing w:after="0" w:line="240" w:lineRule="auto"/>
+              <w:jc w:val="center"/>
+            </w:pPr>
+            <w:r>
+              <w:rPr>
+                <w:rFonts w:ascii="Times New Roman" w:hAnsi="Times New Roman" w:eastAsia="Times New Roman"/>
+                <w:b w:val="0"/>
+                <w:sz w:val="13"/>
+              </w:rPr>
+              <w:t>2026-06-10</w:t>
+            </w:r>
+          </w:p>
+        </w:tc>
+        <w:tc>
+          <w:tcPr>
+            <w:tcW w:type="dxa" w:w="1606"/>
+            <w:vAlign w:val="center"/>
+          </w:tcPr>
+          <w:p>
+            <w:pPr>
+              <w:spacing w:after="0" w:line="240" w:lineRule="auto"/>
+              <w:jc w:val="center"/>
+            </w:pPr>
+            <w:r>
+              <w:rPr>
+                <w:rFonts w:ascii="Times New Roman" w:hAnsi="Times New Roman" w:eastAsia="Times New Roman"/>
+                <w:b w:val="0"/>
+                <w:sz w:val="13"/>
+              </w:rPr>
+              <w:t>6998</w:t>
+            </w:r>
+          </w:p>
+        </w:tc>
+        <w:tc>
+          <w:tcPr>
+            <w:tcW w:type="dxa" w:w="1606"/>
+            <w:vAlign w:val="center"/>
+          </w:tcPr>
+          <w:p>
+            <w:pPr>
+              <w:spacing w:after="0" w:line="240" w:lineRule="auto"/>
+              <w:jc w:val="center"/>
+            </w:pPr>
+            <w:r>
+              <w:rPr>
+                <w:rFonts w:ascii="Times New Roman" w:hAnsi="Times New Roman" w:eastAsia="Times New Roman"/>
+                <w:b w:val="0"/>
+                <w:sz w:val="13"/>
+              </w:rPr>
+              <w:t>2026-06-10</w:t>
+            </w:r>
+          </w:p>
+        </w:tc>
+        <w:tc>
+          <w:tcPr>
+            <w:tcW w:type="dxa" w:w="1606"/>
+            <w:vAlign w:val="center"/>
+          </w:tcPr>
+          <w:p>
+            <w:pPr>
+              <w:spacing w:after="0" w:line="240" w:lineRule="auto"/>
+              <w:jc w:val="center"/>
+            </w:pPr>
+            <w:r>
+              <w:rPr>
+                <w:rFonts w:ascii="Times New Roman" w:hAnsi="Times New Roman" w:eastAsia="Times New Roman"/>
+                <w:b w:val="0"/>
+                <w:sz w:val="13"/>
+              </w:rPr>
+              <w:t>1050</w:t>
+            </w:r>
+          </w:p>
+        </w:tc>
+        <w:tc>
+          <w:tcPr>
+            <w:tcW w:type="dxa" w:w="1606"/>
+            <w:vAlign w:val="center"/>
+          </w:tcPr>
+          <w:p>
+            <w:pPr>
+              <w:spacing w:after="0" w:line="240" w:lineRule="auto"/>
+              <w:jc w:val="center"/>
+            </w:pPr>
+            <w:r>
+              <w:rPr>
+                <w:rFonts w:ascii="Times New Roman" w:hAnsi="Times New Roman" w:eastAsia="Times New Roman"/>
+                <w:b w:val="0"/>
+                <w:sz w:val="13"/>
+              </w:rPr>
+              <w:t>2026-06-10</w:t>
+            </w:r>
+          </w:p>
+        </w:tc>
+        <w:tc>
+          <w:tcPr>
+            <w:tcW w:type="dxa" w:w="1606"/>
+            <w:vAlign w:val="center"/>
+          </w:tcPr>
+          <w:p>
+            <w:pPr>
+              <w:spacing w:after="0" w:line="240" w:lineRule="auto"/>
+              <w:jc w:val="center"/>
+            </w:pPr>
+            <w:r>
+              <w:rPr>
+                <w:rFonts w:ascii="Times New Roman" w:hAnsi="Times New Roman" w:eastAsia="Times New Roman"/>
+                <w:b w:val="0"/>
+                <w:sz w:val="13"/>
+              </w:rPr>
+              <w:t>0/0</w:t>
             </w:r>
           </w:p>
         </w:tc>

</xml_diff>